<commit_message>
feat: plantilla con {{ clausula_seremi }} y lógica en app.py
</commit_message>
<xml_diff>
--- a/templates/templatescotizacion_template.docx
+++ b/templates/templatescotizacion_template.docx
@@ -198,23 +198,7 @@
           <w:rFonts w:ascii="DejaVu Sans" w:hAnsi="DejaVu Sans" w:cs="DejaVu Sans"/>
           <w:sz w:val="32"/>
         </w:rPr>
-        <w:t>{{</w:t>
-      </w:r>
-      <w:proofErr w:type="spellStart"/>
-      <w:r>
-        <w:rPr>
-          <w:rFonts w:ascii="DejaVu Sans" w:hAnsi="DejaVu Sans" w:cs="DejaVu Sans"/>
-          <w:sz w:val="32"/>
-        </w:rPr>
-        <w:t>direccion</w:t>
-      </w:r>
-      <w:proofErr w:type="spellEnd"/>
-      <w:r>
-        <w:rPr>
-          <w:rFonts w:ascii="DejaVu Sans" w:hAnsi="DejaVu Sans" w:cs="DejaVu Sans"/>
-          <w:sz w:val="32"/>
-        </w:rPr>
-        <w:t>}}</w:t>
+        <w:t>{{direccion}}</w:t>
       </w:r>
     </w:p>
     <w:p>
@@ -537,8 +521,7 @@
         <w:spacing w:before="211" w:line="276" w:lineRule="auto"/>
         <w:ind w:left="400"/>
         <w:rPr>
-          <w:rFonts w:ascii="DejaVu Sans" w:hAnsi="DejaVu Sans" w:cs="DejaVu Sans"/>
-          <w:sz w:val="32"/>
+          <w:sz w:val="20"/>
         </w:rPr>
       </w:pPr>
       <w:r>
@@ -1428,231 +1411,8 @@
           <w:w w:val="105"/>
           <w:sz w:val="32"/>
         </w:rPr>
-        <w:t xml:space="preserve">{{ </w:t>
-      </w:r>
-      <w:proofErr w:type="spellStart"/>
-      <w:r>
-        <w:rPr>
-          <w:rFonts w:ascii="DejaVu Sans" w:hAnsi="DejaVu Sans" w:cs="DejaVu Sans"/>
-          <w:w w:val="105"/>
-          <w:sz w:val="32"/>
-        </w:rPr>
-        <w:t>descripcion</w:t>
-      </w:r>
-      <w:proofErr w:type="spellEnd"/>
-      <w:r>
-        <w:rPr>
-          <w:rFonts w:ascii="DejaVu Sans" w:hAnsi="DejaVu Sans" w:cs="DejaVu Sans"/>
-          <w:w w:val="105"/>
-          <w:sz w:val="32"/>
-        </w:rPr>
-        <w:t xml:space="preserve"> }}</w:t>
-      </w:r>
-      <w:r>
-        <w:rPr>
-          <w:rFonts w:ascii="DejaVu Sans" w:hAnsi="DejaVu Sans" w:cs="DejaVu Sans"/>
-          <w:w w:val="105"/>
-          <w:sz w:val="32"/>
-        </w:rPr>
-        <w:t xml:space="preserve">, </w:t>
-      </w:r>
-      <w:r>
-        <w:rPr>
-          <w:rFonts w:ascii="DejaVu Sans" w:hAnsi="DejaVu Sans" w:cs="DejaVu Sans"/>
-          <w:w w:val="105"/>
-          <w:sz w:val="32"/>
-        </w:rPr>
-        <w:t>con instalación de estaciones</w:t>
-      </w:r>
-      <w:r>
-        <w:rPr>
-          <w:rFonts w:ascii="DejaVu Sans" w:hAnsi="DejaVu Sans" w:cs="DejaVu Sans"/>
-          <w:spacing w:val="40"/>
-          <w:w w:val="105"/>
-          <w:sz w:val="32"/>
-        </w:rPr>
-        <w:t xml:space="preserve"> </w:t>
-      </w:r>
-      <w:r>
-        <w:rPr>
-          <w:rFonts w:ascii="DejaVu Sans" w:hAnsi="DejaVu Sans" w:cs="DejaVu Sans"/>
-          <w:spacing w:val="-2"/>
-          <w:w w:val="105"/>
-          <w:sz w:val="32"/>
-        </w:rPr>
-        <w:t>cebaderas</w:t>
-      </w:r>
-      <w:r>
-        <w:rPr>
-          <w:rFonts w:ascii="DejaVu Sans" w:hAnsi="DejaVu Sans" w:cs="DejaVu Sans"/>
-          <w:spacing w:val="-29"/>
-          <w:w w:val="105"/>
-          <w:sz w:val="32"/>
-        </w:rPr>
-        <w:t xml:space="preserve"> </w:t>
-      </w:r>
-      <w:r>
-        <w:rPr>
-          <w:rFonts w:ascii="DejaVu Sans" w:hAnsi="DejaVu Sans" w:cs="DejaVu Sans"/>
-          <w:spacing w:val="-2"/>
-          <w:w w:val="105"/>
-          <w:sz w:val="32"/>
-        </w:rPr>
-        <w:t>y</w:t>
-      </w:r>
-      <w:r>
-        <w:rPr>
-          <w:rFonts w:ascii="DejaVu Sans" w:hAnsi="DejaVu Sans" w:cs="DejaVu Sans"/>
-          <w:spacing w:val="-29"/>
-          <w:w w:val="105"/>
-          <w:sz w:val="32"/>
-        </w:rPr>
-        <w:t xml:space="preserve"> </w:t>
-      </w:r>
-      <w:r>
-        <w:rPr>
-          <w:rFonts w:ascii="DejaVu Sans" w:hAnsi="DejaVu Sans" w:cs="DejaVu Sans"/>
-          <w:spacing w:val="-2"/>
-          <w:w w:val="105"/>
-          <w:sz w:val="32"/>
-        </w:rPr>
-        <w:t>entrega</w:t>
-      </w:r>
-      <w:r>
-        <w:rPr>
-          <w:rFonts w:ascii="DejaVu Sans" w:hAnsi="DejaVu Sans" w:cs="DejaVu Sans"/>
-          <w:spacing w:val="-29"/>
-          <w:w w:val="105"/>
-          <w:sz w:val="32"/>
-        </w:rPr>
-        <w:t xml:space="preserve"> </w:t>
-      </w:r>
-      <w:r>
-        <w:rPr>
-          <w:rFonts w:ascii="DejaVu Sans" w:hAnsi="DejaVu Sans" w:cs="DejaVu Sans"/>
-          <w:spacing w:val="-2"/>
-          <w:w w:val="105"/>
-          <w:sz w:val="32"/>
-        </w:rPr>
-        <w:t>de</w:t>
-      </w:r>
-      <w:r>
-        <w:rPr>
-          <w:rFonts w:ascii="DejaVu Sans" w:hAnsi="DejaVu Sans" w:cs="DejaVu Sans"/>
-          <w:spacing w:val="-29"/>
-          <w:w w:val="105"/>
-          <w:sz w:val="32"/>
-        </w:rPr>
-        <w:t xml:space="preserve"> </w:t>
-      </w:r>
-      <w:r>
-        <w:rPr>
-          <w:rFonts w:ascii="DejaVu Sans" w:hAnsi="DejaVu Sans" w:cs="DejaVu Sans"/>
-          <w:spacing w:val="-2"/>
-          <w:w w:val="105"/>
-          <w:sz w:val="32"/>
-        </w:rPr>
-        <w:t>informe</w:t>
-      </w:r>
-      <w:r>
-        <w:rPr>
-          <w:rFonts w:ascii="DejaVu Sans" w:hAnsi="DejaVu Sans" w:cs="DejaVu Sans"/>
-          <w:spacing w:val="-29"/>
-          <w:w w:val="105"/>
-          <w:sz w:val="32"/>
-        </w:rPr>
-        <w:t xml:space="preserve"> </w:t>
-      </w:r>
-      <w:r>
-        <w:rPr>
-          <w:rFonts w:ascii="DejaVu Sans" w:hAnsi="DejaVu Sans" w:cs="DejaVu Sans"/>
-          <w:spacing w:val="-2"/>
-          <w:w w:val="105"/>
-          <w:sz w:val="32"/>
-        </w:rPr>
-        <w:t>sanitario</w:t>
-      </w:r>
-      <w:r>
-        <w:rPr>
-          <w:rFonts w:ascii="DejaVu Sans" w:hAnsi="DejaVu Sans" w:cs="DejaVu Sans"/>
-          <w:spacing w:val="-29"/>
-          <w:w w:val="105"/>
-          <w:sz w:val="32"/>
-        </w:rPr>
-        <w:t xml:space="preserve"> </w:t>
-      </w:r>
-      <w:r>
-        <w:rPr>
-          <w:rFonts w:ascii="DejaVu Sans" w:hAnsi="DejaVu Sans" w:cs="DejaVu Sans"/>
-          <w:spacing w:val="-2"/>
-          <w:w w:val="105"/>
-          <w:sz w:val="32"/>
-        </w:rPr>
-        <w:t>conforme</w:t>
-      </w:r>
-      <w:r>
-        <w:rPr>
-          <w:rFonts w:ascii="DejaVu Sans" w:hAnsi="DejaVu Sans" w:cs="DejaVu Sans"/>
-          <w:spacing w:val="-29"/>
-          <w:w w:val="105"/>
-          <w:sz w:val="32"/>
-        </w:rPr>
-        <w:t xml:space="preserve"> </w:t>
-      </w:r>
-      <w:r>
-        <w:rPr>
-          <w:rFonts w:ascii="DejaVu Sans" w:hAnsi="DejaVu Sans" w:cs="DejaVu Sans"/>
-          <w:spacing w:val="-2"/>
-          <w:w w:val="105"/>
-          <w:sz w:val="32"/>
-        </w:rPr>
-        <w:t>a</w:t>
-      </w:r>
-      <w:r>
-        <w:rPr>
-          <w:rFonts w:ascii="DejaVu Sans" w:hAnsi="DejaVu Sans" w:cs="DejaVu Sans"/>
-          <w:spacing w:val="-29"/>
-          <w:w w:val="105"/>
-          <w:sz w:val="32"/>
-        </w:rPr>
-        <w:t xml:space="preserve"> </w:t>
-      </w:r>
-      <w:r>
-        <w:rPr>
-          <w:rFonts w:ascii="DejaVu Sans" w:hAnsi="DejaVu Sans" w:cs="DejaVu Sans"/>
-          <w:spacing w:val="-2"/>
-          <w:w w:val="105"/>
-          <w:sz w:val="32"/>
-        </w:rPr>
-        <w:t>exigencias</w:t>
-      </w:r>
-      <w:r>
-        <w:rPr>
-          <w:rFonts w:ascii="DejaVu Sans" w:hAnsi="DejaVu Sans" w:cs="DejaVu Sans"/>
-          <w:spacing w:val="-29"/>
-          <w:w w:val="105"/>
-          <w:sz w:val="32"/>
-        </w:rPr>
-        <w:t xml:space="preserve"> </w:t>
-      </w:r>
-      <w:r>
-        <w:rPr>
-          <w:rFonts w:ascii="DejaVu Sans" w:hAnsi="DejaVu Sans" w:cs="DejaVu Sans"/>
-          <w:spacing w:val="-2"/>
-          <w:w w:val="105"/>
-          <w:sz w:val="32"/>
-        </w:rPr>
-        <w:t>SEREMI.</w:t>
-      </w:r>
-    </w:p>
-    <w:p>
-      <w:pPr>
-        <w:pStyle w:val="Textoindependiente"/>
-        <w:spacing w:before="49"/>
-        <w:rPr>
-          <w:sz w:val="20"/>
-        </w:rPr>
-      </w:pPr>
+        <w:t>{{ descripcion }}{{ clausula_seremi }}</w:t>
+      </w:r>
     </w:p>
     <w:p>
       <w:pPr>
@@ -1679,14 +1439,14 @@
         <w:tblLook w:val="04A0" w:firstRow="1" w:lastRow="0" w:firstColumn="1" w:lastColumn="0" w:noHBand="0" w:noVBand="1"/>
       </w:tblPr>
       <w:tblGrid>
-        <w:gridCol w:w="6539"/>
-        <w:gridCol w:w="1843"/>
-        <w:gridCol w:w="5386"/>
+        <w:gridCol w:w="5972"/>
+        <w:gridCol w:w="4252"/>
+        <w:gridCol w:w="3544"/>
       </w:tblGrid>
       <w:tr>
         <w:tc>
           <w:tcPr>
-            <w:tcW w:w="6539" w:type="dxa"/>
+            <w:tcW w:w="5972" w:type="dxa"/>
             <w:shd w:val="clear" w:color="auto" w:fill="548DD4" w:themeFill="text2" w:themeFillTint="99"/>
             <w:vAlign w:val="center"/>
           </w:tcPr>
@@ -1719,7 +1479,7 @@
         </w:tc>
         <w:tc>
           <w:tcPr>
-            <w:tcW w:w="1843" w:type="dxa"/>
+            <w:tcW w:w="4252" w:type="dxa"/>
             <w:shd w:val="clear" w:color="auto" w:fill="548DD4" w:themeFill="text2" w:themeFillTint="99"/>
             <w:vAlign w:val="center"/>
           </w:tcPr>
@@ -1746,13 +1506,13 @@
                 <w:sz w:val="28"/>
                 <w:szCs w:val="36"/>
               </w:rPr>
-              <w:t>M2</w:t>
+              <w:t>CANTIDAD (u / m² / m³)</w:t>
             </w:r>
           </w:p>
         </w:tc>
         <w:tc>
           <w:tcPr>
-            <w:tcW w:w="5386" w:type="dxa"/>
+            <w:tcW w:w="3544" w:type="dxa"/>
             <w:shd w:val="clear" w:color="auto" w:fill="548DD4" w:themeFill="text2" w:themeFillTint="99"/>
             <w:vAlign w:val="center"/>
           </w:tcPr>
@@ -1817,7 +1577,7 @@
       <w:tr>
         <w:tc>
           <w:tcPr>
-            <w:tcW w:w="6539" w:type="dxa"/>
+            <w:tcW w:w="5972" w:type="dxa"/>
             <w:vAlign w:val="center"/>
           </w:tcPr>
           <w:p>
@@ -1837,31 +1597,13 @@
                 <w:sz w:val="32"/>
                 <w:szCs w:val="32"/>
               </w:rPr>
-              <w:t xml:space="preserve">{{ </w:t>
-            </w:r>
-            <w:proofErr w:type="spellStart"/>
-            <w:r>
-              <w:rPr>
-                <w:rFonts w:ascii="DejaVu Sans" w:hAnsi="DejaVu Sans" w:cs="DejaVu Sans"/>
-                <w:sz w:val="32"/>
-                <w:szCs w:val="32"/>
-              </w:rPr>
-              <w:t>linea_servicio</w:t>
-            </w:r>
-            <w:proofErr w:type="spellEnd"/>
-            <w:r>
-              <w:rPr>
-                <w:rFonts w:ascii="DejaVu Sans" w:hAnsi="DejaVu Sans" w:cs="DejaVu Sans"/>
-                <w:sz w:val="32"/>
-                <w:szCs w:val="32"/>
-              </w:rPr>
-              <w:t xml:space="preserve"> }}</w:t>
+              <w:t>{{ linea_servicio }}</w:t>
             </w:r>
           </w:p>
         </w:tc>
         <w:tc>
           <w:tcPr>
-            <w:tcW w:w="1843" w:type="dxa"/>
+            <w:tcW w:w="4252" w:type="dxa"/>
             <w:vAlign w:val="center"/>
           </w:tcPr>
           <w:p>
@@ -1881,13 +1623,13 @@
                 <w:sz w:val="32"/>
                 <w:szCs w:val="32"/>
               </w:rPr>
-              <w:t>{{ m2 }}</w:t>
+              <w:t>{{ linea_medida }}</w:t>
             </w:r>
           </w:p>
         </w:tc>
         <w:tc>
           <w:tcPr>
-            <w:tcW w:w="5386" w:type="dxa"/>
+            <w:tcW w:w="3544" w:type="dxa"/>
             <w:vAlign w:val="center"/>
           </w:tcPr>
           <w:p>
@@ -1907,25 +1649,7 @@
                 <w:sz w:val="32"/>
                 <w:szCs w:val="32"/>
               </w:rPr>
-              <w:t xml:space="preserve">{{ </w:t>
-            </w:r>
-            <w:proofErr w:type="spellStart"/>
-            <w:r>
-              <w:rPr>
-                <w:rFonts w:ascii="DejaVu Sans" w:hAnsi="DejaVu Sans" w:cs="DejaVu Sans"/>
-                <w:sz w:val="32"/>
-                <w:szCs w:val="32"/>
-              </w:rPr>
-              <w:t>linea_total</w:t>
-            </w:r>
-            <w:proofErr w:type="spellEnd"/>
-            <w:r>
-              <w:rPr>
-                <w:rFonts w:ascii="DejaVu Sans" w:hAnsi="DejaVu Sans" w:cs="DejaVu Sans"/>
-                <w:sz w:val="32"/>
-                <w:szCs w:val="32"/>
-              </w:rPr>
-              <w:t xml:space="preserve"> }}</w:t>
+              <w:t>{{ linea_total }}</w:t>
             </w:r>
           </w:p>
         </w:tc>
@@ -3120,6 +2844,14 @@
         </w:rPr>
         <w:t>utilizados</w:t>
       </w:r>
+    </w:p>
+    <w:p>
+      <w:pPr>
+        <w:pStyle w:val="Textoindependiente"/>
+        <w:rPr>
+          <w:sz w:val="34"/>
+        </w:rPr>
+      </w:pPr>
     </w:p>
     <w:p>
       <w:pPr>

</xml_diff>